<commit_message>
Seccion 4.4 analizada y renderizada
</commit_message>
<xml_diff>
--- a/output/seccion_4_2025_11.docx
+++ b/output/seccion_4_2025_11.docx
@@ -1379,7 +1379,10 @@
         <w:ind w:left="1440"/>
       </w:pPr>
       <w:r>
-        <w:t xml:space="preserve">sg-14</w:t>
+        <w:t xml:space="preserve">Para el periodo comprendido entre el 01 al 30 de Noviembre del 2025 se realizó la presentación de solicitud de inclusión de bolsa de repuestos de:</w:t>
+      </w:r>
+      <w:r>
+        <w:t xml:space="preserve"> </w:t>
       </w:r>
     </w:p>
     <w:tbl>
@@ -1390,13 +1393,10 @@
         <w:tblLayout w:type="autofit"/>
       </w:tblPr>
       <w:tblGrid>
-        <w:gridCol w:w="1543"/>
-        <w:gridCol w:w="1543"/>
-        <w:gridCol w:w="1543"/>
-        <w:gridCol w:w="1543"/>
-        <w:gridCol w:w="1543"/>
-        <w:gridCol w:w="1543"/>
-        <w:gridCol w:w="1543"/>
+        <w:gridCol w:w="2700"/>
+        <w:gridCol w:w="2700"/>
+        <w:gridCol w:w="2700"/>
+        <w:gridCol w:w="2700"/>
       </w:tblGrid>
       <w:tr>
         <w:trPr>
@@ -1404,7 +1404,7 @@
         </w:trPr>
         <w:tc>
           <w:tcPr>
-            <w:tcW w:type="dxa" w:w="1543"/>
+            <w:tcW w:type="dxa" w:w="2700"/>
             <w:shd w:fill="1F4E79"/>
             <w:vAlign w:val="center"/>
           </w:tcPr>
@@ -1418,13 +1418,13 @@
                 <w:color w:val="FFFFFF"/>
                 <w:sz w:val="16"/>
               </w:rPr>
-              <w:t>No.</w:t>
+              <w:t>Ítem</w:t>
             </w:r>
           </w:p>
         </w:tc>
         <w:tc>
           <w:tcPr>
-            <w:tcW w:type="dxa" w:w="1543"/>
+            <w:tcW w:type="dxa" w:w="2700"/>
             <w:shd w:fill="1F4E79"/>
             <w:vAlign w:val="center"/>
           </w:tcPr>
@@ -1438,13 +1438,13 @@
                 <w:color w:val="FFFFFF"/>
                 <w:sz w:val="16"/>
               </w:rPr>
-              <w:t>DESCRIPCIÓN</w:t>
+              <w:t>Fecha</w:t>
             </w:r>
           </w:p>
         </w:tc>
         <w:tc>
           <w:tcPr>
-            <w:tcW w:type="dxa" w:w="1543"/>
+            <w:tcW w:type="dxa" w:w="2700"/>
             <w:shd w:fill="1F4E79"/>
             <w:vAlign w:val="center"/>
           </w:tcPr>
@@ -1458,13 +1458,13 @@
                 <w:color w:val="FFFFFF"/>
                 <w:sz w:val="16"/>
               </w:rPr>
-              <w:t>CANT.</w:t>
+              <w:t>Consecutivo ETB</w:t>
             </w:r>
           </w:p>
         </w:tc>
         <w:tc>
           <w:tcPr>
-            <w:tcW w:type="dxa" w:w="1543"/>
+            <w:tcW w:type="dxa" w:w="2700"/>
             <w:shd w:fill="1F4E79"/>
             <w:vAlign w:val="center"/>
           </w:tcPr>
@@ -1478,67 +1478,7 @@
                 <w:color w:val="FFFFFF"/>
                 <w:sz w:val="16"/>
               </w:rPr>
-              <w:t>UND</w:t>
-            </w:r>
-          </w:p>
-        </w:tc>
-        <w:tc>
-          <w:tcPr>
-            <w:tcW w:type="dxa" w:w="1543"/>
-            <w:shd w:fill="1F4E79"/>
-            <w:vAlign w:val="center"/>
-          </w:tcPr>
-          <w:p>
-            <w:pPr>
-              <w:jc w:val="center"/>
-            </w:pPr>
-            <w:r>
-              <w:rPr>
-                <w:b/>
-                <w:color w:val="FFFFFF"/>
-                <w:sz w:val="16"/>
-              </w:rPr>
-              <w:t>VALOR UNIT.</w:t>
-            </w:r>
-          </w:p>
-        </w:tc>
-        <w:tc>
-          <w:tcPr>
-            <w:tcW w:type="dxa" w:w="1543"/>
-            <w:shd w:fill="1F4E79"/>
-            <w:vAlign w:val="center"/>
-          </w:tcPr>
-          <w:p>
-            <w:pPr>
-              <w:jc w:val="center"/>
-            </w:pPr>
-            <w:r>
-              <w:rPr>
-                <w:b/>
-                <w:color w:val="FFFFFF"/>
-                <w:sz w:val="16"/>
-              </w:rPr>
-              <w:t>VALOR TOTAL</w:t>
-            </w:r>
-          </w:p>
-        </w:tc>
-        <w:tc>
-          <w:tcPr>
-            <w:tcW w:type="dxa" w:w="1543"/>
-            <w:shd w:fill="1F4E79"/>
-            <w:vAlign w:val="center"/>
-          </w:tcPr>
-          <w:p>
-            <w:pPr>
-              <w:jc w:val="center"/>
-            </w:pPr>
-            <w:r>
-              <w:rPr>
-                <w:b/>
-                <w:color w:val="FFFFFF"/>
-                <w:sz w:val="16"/>
-              </w:rPr>
-              <w:t>JUSTIFICACIÓN</w:t>
+              <w:t>Descripción</w:t>
             </w:r>
           </w:p>
         </w:tc>
@@ -1546,7 +1486,7 @@
       <w:tr>
         <w:tc>
           <w:tcPr>
-            <w:tcW w:type="dxa" w:w="1543"/>
+            <w:tcW w:type="dxa" w:w="2700"/>
             <w:shd w:fill="FFFFFF"/>
             <w:vAlign w:val="center"/>
           </w:tcPr>
@@ -1565,7 +1505,45 @@
         </w:tc>
         <w:tc>
           <w:tcPr>
-            <w:tcW w:type="dxa" w:w="1543"/>
+            <w:tcW w:type="dxa" w:w="2700"/>
+            <w:shd w:fill="FFFFFF"/>
+            <w:vAlign w:val="center"/>
+          </w:tcPr>
+          <w:p>
+            <w:pPr>
+              <w:jc w:val="center"/>
+            </w:pPr>
+            <w:r>
+              <w:rPr>
+                <w:color w:val="000000"/>
+                <w:sz w:val="16"/>
+              </w:rPr>
+              <w:t>03/12/2025</w:t>
+            </w:r>
+          </w:p>
+        </w:tc>
+        <w:tc>
+          <w:tcPr>
+            <w:tcW w:type="dxa" w:w="2700"/>
+            <w:shd w:fill="FFFFFF"/>
+            <w:vAlign w:val="center"/>
+          </w:tcPr>
+          <w:p>
+            <w:pPr>
+              <w:jc w:val="center"/>
+            </w:pPr>
+            <w:r>
+              <w:rPr>
+                <w:color w:val="000000"/>
+                <w:sz w:val="16"/>
+              </w:rPr>
+              <w:t>sg-14</w:t>
+            </w:r>
+          </w:p>
+        </w:tc>
+        <w:tc>
+          <w:tcPr>
+            <w:tcW w:type="dxa" w:w="2700"/>
             <w:shd w:fill="FFFFFF"/>
             <w:vAlign w:val="center"/>
           </w:tcPr>
@@ -1579,235 +1557,6 @@
                 <w:sz w:val="16"/>
               </w:rPr>
               <w:t>dasfeasdfasd</w:t>
-            </w:r>
-          </w:p>
-        </w:tc>
-        <w:tc>
-          <w:tcPr>
-            <w:tcW w:type="dxa" w:w="1543"/>
-            <w:shd w:fill="FFFFFF"/>
-            <w:vAlign w:val="center"/>
-          </w:tcPr>
-          <w:p>
-            <w:pPr>
-              <w:jc w:val="center"/>
-            </w:pPr>
-            <w:r>
-              <w:rPr>
-                <w:color w:val="000000"/>
-                <w:sz w:val="16"/>
-              </w:rPr>
-              <w:t>1</w:t>
-            </w:r>
-          </w:p>
-        </w:tc>
-        <w:tc>
-          <w:tcPr>
-            <w:tcW w:type="dxa" w:w="1543"/>
-            <w:shd w:fill="FFFFFF"/>
-            <w:vAlign w:val="center"/>
-          </w:tcPr>
-          <w:p>
-            <w:pPr>
-              <w:jc w:val="center"/>
-            </w:pPr>
-            <w:r>
-              <w:rPr>
-                <w:color w:val="000000"/>
-                <w:sz w:val="16"/>
-              </w:rPr>
-              <w:t>UN</w:t>
-            </w:r>
-          </w:p>
-        </w:tc>
-        <w:tc>
-          <w:tcPr>
-            <w:tcW w:type="dxa" w:w="1543"/>
-            <w:shd w:fill="FFFFFF"/>
-            <w:vAlign w:val="center"/>
-          </w:tcPr>
-          <w:p>
-            <w:pPr>
-              <w:jc w:val="center"/>
-            </w:pPr>
-            <w:r>
-              <w:rPr>
-                <w:color w:val="000000"/>
-                <w:sz w:val="16"/>
-              </w:rPr>
-              <w:t>-</w:t>
-            </w:r>
-          </w:p>
-        </w:tc>
-        <w:tc>
-          <w:tcPr>
-            <w:tcW w:type="dxa" w:w="1543"/>
-            <w:shd w:fill="FFFFFF"/>
-            <w:vAlign w:val="center"/>
-          </w:tcPr>
-          <w:p>
-            <w:pPr>
-              <w:jc w:val="center"/>
-            </w:pPr>
-            <w:r>
-              <w:rPr>
-                <w:color w:val="000000"/>
-                <w:sz w:val="16"/>
-              </w:rPr>
-              <w:t>-</w:t>
-            </w:r>
-          </w:p>
-        </w:tc>
-        <w:tc>
-          <w:tcPr>
-            <w:tcW w:type="dxa" w:w="1543"/>
-            <w:shd w:fill="FFFFFF"/>
-            <w:vAlign w:val="center"/>
-          </w:tcPr>
-          <w:p>
-            <w:pPr>
-              <w:jc w:val="center"/>
-            </w:pPr>
-            <w:r>
-              <w:rPr>
-                <w:color w:val="000000"/>
-                <w:sz w:val="16"/>
-              </w:rPr>
-            </w:r>
-          </w:p>
-        </w:tc>
-      </w:tr>
-      <w:tr>
-        <w:tc>
-          <w:tcPr>
-            <w:tcW w:type="dxa" w:w="1543"/>
-            <w:shd w:fill="F2F2F2"/>
-            <w:vAlign w:val="center"/>
-          </w:tcPr>
-          <w:p>
-            <w:pPr>
-              <w:jc w:val="left"/>
-            </w:pPr>
-            <w:r>
-              <w:rPr>
-                <w:color w:val="000000"/>
-                <w:sz w:val="16"/>
-              </w:rPr>
-              <w:t>1</w:t>
-            </w:r>
-          </w:p>
-        </w:tc>
-        <w:tc>
-          <w:tcPr>
-            <w:tcW w:type="dxa" w:w="1543"/>
-            <w:shd w:fill="F2F2F2"/>
-            <w:vAlign w:val="center"/>
-          </w:tcPr>
-          <w:p>
-            <w:pPr>
-              <w:jc w:val="center"/>
-            </w:pPr>
-            <w:r>
-              <w:rPr>
-                <w:color w:val="000000"/>
-                <w:sz w:val="16"/>
-              </w:rPr>
-              <w:t>TOTAL</w:t>
-            </w:r>
-          </w:p>
-        </w:tc>
-        <w:tc>
-          <w:tcPr>
-            <w:tcW w:type="dxa" w:w="1543"/>
-            <w:shd w:fill="F2F2F2"/>
-            <w:vAlign w:val="center"/>
-          </w:tcPr>
-          <w:p>
-            <w:pPr>
-              <w:jc w:val="center"/>
-            </w:pPr>
-            <w:r>
-              <w:rPr>
-                <w:color w:val="000000"/>
-                <w:sz w:val="16"/>
-              </w:rPr>
-              <w:t>1</w:t>
-            </w:r>
-          </w:p>
-        </w:tc>
-        <w:tc>
-          <w:tcPr>
-            <w:tcW w:type="dxa" w:w="1543"/>
-            <w:shd w:fill="F2F2F2"/>
-            <w:vAlign w:val="center"/>
-          </w:tcPr>
-          <w:p>
-            <w:pPr>
-              <w:jc w:val="center"/>
-            </w:pPr>
-            <w:r>
-              <w:rPr>
-                <w:color w:val="000000"/>
-                <w:sz w:val="16"/>
-              </w:rPr>
-              <w:t>0</w:t>
-            </w:r>
-          </w:p>
-        </w:tc>
-        <w:tc>
-          <w:tcPr>
-            <w:tcW w:type="dxa" w:w="1543"/>
-            <w:shd w:fill="F2F2F2"/>
-            <w:vAlign w:val="center"/>
-          </w:tcPr>
-          <w:p>
-            <w:pPr>
-              <w:jc w:val="center"/>
-            </w:pPr>
-            <w:r>
-              <w:rPr>
-                <w:color w:val="000000"/>
-                <w:sz w:val="16"/>
-              </w:rPr>
-              <w:t>-</w:t>
-            </w:r>
-          </w:p>
-        </w:tc>
-        <w:tc>
-          <w:tcPr>
-            <w:tcW w:type="dxa" w:w="1543"/>
-            <w:shd w:fill="F2F2F2"/>
-            <w:vAlign w:val="center"/>
-          </w:tcPr>
-          <w:p>
-            <w:pPr>
-              <w:jc w:val="center"/>
-            </w:pPr>
-            <w:r>
-              <w:rPr>
-                <w:color w:val="000000"/>
-                <w:sz w:val="16"/>
-              </w:rPr>
-              <w:t>-</w:t>
-            </w:r>
-          </w:p>
-        </w:tc>
-        <w:tc>
-          <w:tcPr>
-            <w:tcW w:type="dxa" w:w="1543"/>
-            <w:shd w:fill="F2F2F2"/>
-            <w:vAlign w:val="center"/>
-          </w:tcPr>
-          <w:p>
-            <w:pPr>
-              <w:jc w:val="center"/>
-            </w:pPr>
-            <w:r>
-              <w:rPr>
-                <w:color w:val="000000"/>
-                <w:sz w:val="16"/>
-              </w:rPr>
-              <w:t>0</w:t>
             </w:r>
           </w:p>
         </w:tc>

</xml_diff>